<commit_message>
Correct legal entity name throughout site, agent, and contract
The legal entity is TSD Ventures, LLC — a single NC LLC. TSD Modernization
Solutions and TSD Mobile Detailing are operating brands under it, not
separate legal entities. Prior copy named "a division of TSD Incorporated,
LLC" or used "TSD Modernization Solutions, LLC" as the contracting party —
neither is real.

- index.html: JSON-LD legalName -> "TSD Ventures, LLC"
- src/Layout.jsx: footer tagline -> "A brand of TSD Ventures, LLC"
- api/agent.js: system prompt now states the LLC structure explicitly
- contracts/agreement-of-work-template.docx: party intro, signature block,
  and page footer -> TSD Ventures, LLC (operating the TSD Modernization
  Solutions brand)

Co-Authored-By: Claude Opus 4.7 (1M context) <noreply@anthropic.com>
</commit_message>
<xml_diff>
--- a/tsd-modernization/contracts/agreement-of-work-template.docx
+++ b/tsd-modernization/contracts/agreement-of-work-template.docx
@@ -54,14 +54,14 @@
           <w:sz w:val="22"/>
           <w:szCs w:val="22"/>
         </w:rPr>
-        <w:t xml:space="preserve">TSD Modernization Solutions, LLC</w:t>
-      </w:r>
-      <w:r>
-        <w:rPr>
-          <w:sz w:val="22"/>
-          <w:szCs w:val="22"/>
-        </w:rPr>
-        <w:t xml:space="preserve">, a North Carolina limited liability company (“TSD”), and</w:t>
+        <w:t xml:space="preserve">TSD Ventures, LLC</w:t>
+      </w:r>
+      <w:r>
+        <w:rPr>
+          <w:sz w:val="22"/>
+          <w:szCs w:val="22"/>
+        </w:rPr>
+        <w:t xml:space="preserve">, a North Carolina limited liability company operating the TSD Modernization Solutions brand (“TSD”), and</w:t>
       </w:r>
     </w:p>
     <w:p>
@@ -909,7 +909,7 @@
           <w:sz w:val="22"/>
           <w:szCs w:val="22"/>
         </w:rPr>
-        <w:t xml:space="preserve">TSD Modernization Solutions, LLC</w:t>
+        <w:t xml:space="preserve">TSD Ventures, LLC</w:t>
       </w:r>
     </w:p>
     <w:p>
@@ -1103,7 +1103,7 @@
         <w:sz w:val="18"/>
         <w:szCs w:val="18"/>
       </w:rPr>
-      <w:t xml:space="preserve">TSD Modernization Solutions, LLC — Agreement of Work    Page </w:t>
+      <w:t xml:space="preserve">TSD Ventures, LLC — Agreement of Work    Page </w:t>
     </w:r>
     <w:r>
       <w:rPr>

</xml_diff>